<commit_message>
Docs audit: add Chapter I coverage-gap section (OSY, Announcements, QR docs, hotspot, admin/security)
Adds a Chapter I 'coverage gaps' section to the docs audit covering whole
capabilities missing from Scope/Objectives (OSY sector, Community
Announcements, QR document issuance, crime hotspot heatmap, system
admin/security), with paste-ready text and an altitude rule on what NOT
to add. Regenerated the .docx.
</commit_message>
<xml_diff>
--- a/docx/DOCUMENTATION_FIXES.docx
+++ b/docx/DOCUMENTATION_FIXES.docx
@@ -475,6 +475,411 @@
           <w:i/>
         </w:rPr>
         <w:t>not implemented.</w:t>
+      </w:r>
+    </w:p>
+    <w:p>
+      <w:r>
+        <w:rPr>
+          <w:color w:val="CCCCCC"/>
+        </w:rPr>
+        <w:t>__________________________________________________</w:t>
+      </w:r>
+    </w:p>
+    <w:p>
+      <w:pPr>
+        <w:pStyle w:val="Heading2"/>
+      </w:pPr>
+      <w:r>
+        <w:t>CHAPTER I — Coverage gaps (whole capabilities the paper never mentions)</w:t>
+      </w:r>
+    </w:p>
+    <w:p>
+      <w:r>
+        <w:t xml:space="preserve">The fixes above correct </w:t>
+      </w:r>
+      <w:r>
+        <w:rPr>
+          <w:i/>
+        </w:rPr>
+        <w:t>wrong</w:t>
+      </w:r>
+      <w:r>
+        <w:t xml:space="preserve"> facts. This section is about </w:t>
+      </w:r>
+      <w:r>
+        <w:rPr>
+          <w:i/>
+        </w:rPr>
+        <w:t>missing</w:t>
+      </w:r>
+      <w:r>
+        <w:t xml:space="preserve"> coverage — modules and</w:t>
+      </w:r>
+    </w:p>
+    <w:p>
+      <w:r>
+        <w:t>capabilities that exist in the deployed system but are absent from Chapter I's Scope/Objectives.</w:t>
+      </w:r>
+    </w:p>
+    <w:p>
+      <w:r>
+        <w:rPr>
+          <w:b/>
+        </w:rPr>
+        <w:t>Altitude rule:</w:t>
+      </w:r>
+      <w:r>
+        <w:t xml:space="preserve"> Chapter I is written at </w:t>
+      </w:r>
+      <w:r>
+        <w:rPr>
+          <w:b/>
+        </w:rPr>
+        <w:t>module/capability</w:t>
+      </w:r>
+      <w:r>
+        <w:t xml:space="preserve"> level, not feature level. Do NOT</w:t>
+      </w:r>
+    </w:p>
+    <w:p>
+      <w:r>
+        <w:t>add micro-refinements here (QR PNG download, drag-to-resize disaster circle, audit-log pagination,</w:t>
+      </w:r>
+    </w:p>
+    <w:p>
+      <w:r>
+        <w:t>the "Others" reason field, sitio auto-fill, photo attachments) — those belong in Chapter IV</w:t>
+      </w:r>
+    </w:p>
+    <w:p>
+      <w:r>
+        <w:t>screenshots. Only the module-level gaps below belong in Chapter I.</w:t>
+      </w:r>
+    </w:p>
+    <w:p>
+      <w:pPr>
+        <w:pStyle w:val="Heading3"/>
+      </w:pPr>
+      <w:r>
+        <w:t>🔴 ⓐ Out-of-School Youth (OSY) omitted from vulnerable sectors</w:t>
+      </w:r>
+    </w:p>
+    <w:p>
+      <w:r>
+        <w:t>Objective 2, the Scope "Analytics Modules" bullet, and the Significance section all enumerate</w:t>
+      </w:r>
+    </w:p>
+    <w:p>
+      <w:r>
+        <w:t xml:space="preserve">"senior citizens, solo parents, PWDs" — but the system also tracks </w:t>
+      </w:r>
+      <w:r>
+        <w:rPr>
+          <w:b/>
+        </w:rPr>
+        <w:t>Out-of-School Youth (OSY)</w:t>
+      </w:r>
+    </w:p>
+    <w:p>
+      <w:r>
+        <w:t>(Sector Statistics has an OSY-by-Sitio chart) and voter status. **Add "out-of-school youth" to</w:t>
+      </w:r>
+    </w:p>
+    <w:p>
+      <w:r>
+        <w:t>every vulnerable-sector list** in Chapter I, e.g.:</w:t>
+      </w:r>
+    </w:p>
+    <w:p>
+      <w:pPr>
+        <w:ind w:left="360"/>
+      </w:pPr>
+      <w:r>
+        <w:rPr>
+          <w:i/>
+        </w:rPr>
+        <w:t xml:space="preserve">…senior citizens, solo parents, persons with disabilities (PWDs), </w:t>
+      </w:r>
+      <w:r>
+        <w:rPr>
+          <w:b/>
+          <w:i/>
+        </w:rPr>
+        <w:t>out-of-school youth</w:t>
+      </w:r>
+      <w:r>
+        <w:rPr>
+          <w:i/>
+        </w:rPr>
+        <w:t>, and</w:t>
+      </w:r>
+    </w:p>
+    <w:p>
+      <w:pPr>
+        <w:ind w:left="360"/>
+      </w:pPr>
+      <w:r>
+        <w:rPr>
+          <w:i/>
+        </w:rPr>
+        <w:t>economically disadvantaged households…</w:t>
+      </w:r>
+    </w:p>
+    <w:p>
+      <w:pPr>
+        <w:pStyle w:val="Heading3"/>
+      </w:pPr>
+      <w:r>
+        <w:t>🟠 ⓑ Community Announcements — missing from Scope (ADD a bullet)</w:t>
+      </w:r>
+    </w:p>
+    <w:p>
+      <w:pPr>
+        <w:ind w:left="360"/>
+      </w:pPr>
+      <w:r>
+        <w:rPr>
+          <w:b/>
+          <w:i/>
+        </w:rPr>
+        <w:t>Community Communication:</w:t>
+      </w:r>
+      <w:r>
+        <w:rPr>
+          <w:i/>
+        </w:rPr>
+        <w:t xml:space="preserve"> Posting of barangay announcements to a public bulletin board that</w:t>
+      </w:r>
+    </w:p>
+    <w:p>
+      <w:pPr>
+        <w:ind w:left="360"/>
+      </w:pPr>
+      <w:r>
+        <w:rPr>
+          <w:i/>
+        </w:rPr>
+        <w:t>residents can view without logging in, strengthening transparency and information dissemination.</w:t>
+      </w:r>
+    </w:p>
+    <w:p>
+      <w:pPr>
+        <w:pStyle w:val="Heading3"/>
+      </w:pPr>
+      <w:r>
+        <w:t>🟠 ⓒ QR Scope too narrow — broaden the Resident Management bullet</w:t>
+      </w:r>
+    </w:p>
+    <w:p>
+      <w:r>
+        <w:rPr>
+          <w:b/>
+        </w:rPr>
+        <w:t>Old:</w:t>
+      </w:r>
+      <w:r>
+        <w:t xml:space="preserve"> "…QR-based identity verification to protect resident identity and prevent fraudulent</w:t>
+      </w:r>
+    </w:p>
+    <w:p>
+      <w:r>
+        <w:t>assistance claims."</w:t>
+      </w:r>
+    </w:p>
+    <w:p>
+      <w:r>
+        <w:rPr>
+          <w:b/>
+        </w:rPr>
+        <w:t>New:</w:t>
+      </w:r>
+      <w:r>
+        <w:t xml:space="preserve"> "…QR-based identity verification </w:t>
+      </w:r>
+      <w:r>
+        <w:rPr>
+          <w:b/>
+        </w:rPr>
+        <w:t>and on-the-spot issuance of barangay documents</w:t>
+      </w:r>
+    </w:p>
+    <w:p>
+      <w:r>
+        <w:t>(clearance, certificate of indigency/residency), with every verification logged — protecting</w:t>
+      </w:r>
+    </w:p>
+    <w:p>
+      <w:r>
+        <w:t>resident identity and preventing fraudulent assistance claims."</w:t>
+      </w:r>
+    </w:p>
+    <w:p>
+      <w:pPr>
+        <w:pStyle w:val="Heading3"/>
+      </w:pPr>
+      <w:r>
+        <w:t>🟠 ⓓ Crime Hotspot mapping — name it under GIS</w:t>
+      </w:r>
+    </w:p>
+    <w:p>
+      <w:r>
+        <w:t xml:space="preserve">The Scope lists "crime and incident analytics" but not the </w:t>
+      </w:r>
+      <w:r>
+        <w:rPr>
+          <w:b/>
+        </w:rPr>
+        <w:t>spatial heatmap</w:t>
+      </w:r>
+      <w:r>
+        <w:t>. Append to the GIS</w:t>
+      </w:r>
+    </w:p>
+    <w:p>
+      <w:r>
+        <w:t xml:space="preserve">Integration bullet: "…and a </w:t>
+      </w:r>
+      <w:r>
+        <w:rPr>
+          <w:b/>
+        </w:rPr>
+        <w:t>crime hotspot heatmap</w:t>
+      </w:r>
+      <w:r>
+        <w:t xml:space="preserve"> for spatial crime-pattern analysis."</w:t>
+      </w:r>
+    </w:p>
+    <w:p>
+      <w:pPr>
+        <w:pStyle w:val="Heading3"/>
+      </w:pPr>
+      <w:r>
+        <w:t>🟠 ⓔ System Administration &amp; Security — missing from Scope (ADD a bullet)</w:t>
+      </w:r>
+    </w:p>
+    <w:p>
+      <w:r>
+        <w:t>Data security is the panel's top priority, yet Chapter I never mentions user management, the audit</w:t>
+      </w:r>
+    </w:p>
+    <w:p>
+      <w:r>
+        <w:t>trail, RLS, or backup. Add:</w:t>
+      </w:r>
+    </w:p>
+    <w:p>
+      <w:pPr>
+        <w:ind w:left="360"/>
+      </w:pPr>
+      <w:r>
+        <w:rPr>
+          <w:b/>
+          <w:i/>
+        </w:rPr>
+        <w:t>System Administration &amp; Security:</w:t>
+      </w:r>
+      <w:r>
+        <w:rPr>
+          <w:i/>
+        </w:rPr>
+        <w:t xml:space="preserve"> Role-based user management, an automatic audit trail</w:t>
+      </w:r>
+    </w:p>
+    <w:p>
+      <w:pPr>
+        <w:ind w:left="360"/>
+      </w:pPr>
+      <w:r>
+        <w:rPr>
+          <w:i/>
+        </w:rPr>
+        <w:t>logging every record change, per-role database security (Row-Level Security), and on-demand</w:t>
+      </w:r>
+    </w:p>
+    <w:p>
+      <w:pPr>
+        <w:ind w:left="360"/>
+      </w:pPr>
+      <w:r>
+        <w:rPr>
+          <w:i/>
+        </w:rPr>
+        <w:t>database backup.</w:t>
+      </w:r>
+    </w:p>
+    <w:p>
+      <w:pPr>
+        <w:pStyle w:val="Heading3"/>
+      </w:pPr>
+      <w:r>
+        <w:t>🟢 ⓕ Conceptual Framework (p.8) — feature count + Process box</w:t>
+      </w:r>
+    </w:p>
+    <w:p>
+      <w:r>
+        <w:t>Change "twelve integrated features" → "its integrated modules" (or update the number), and add</w:t>
+      </w:r>
+    </w:p>
+    <w:p>
+      <w:r>
+        <w:rPr>
+          <w:b/>
+        </w:rPr>
+        <w:t>Announcements &amp; Audit Logging</w:t>
+      </w:r>
+      <w:r>
+        <w:t xml:space="preserve"> to the Process box so the framework reflects all modules.</w:t>
+      </w:r>
+    </w:p>
+    <w:p>
+      <w:pPr>
+        <w:pStyle w:val="Heading3"/>
+      </w:pPr>
+      <w:r>
+        <w:t>Summary — what to add vs leave</w:t>
+      </w:r>
+    </w:p>
+    <w:p>
+      <w:pPr>
+        <w:pStyle w:val="ListBullet"/>
+      </w:pPr>
+      <w:r>
+        <w:rPr>
+          <w:b/>
+        </w:rPr>
+        <w:t>Add (module-level):</w:t>
+      </w:r>
+      <w:r>
+        <w:t xml:space="preserve"> OSY sector · Community Announcements · QR document issuance · Crime</w:t>
+      </w:r>
+    </w:p>
+    <w:p>
+      <w:r>
+        <w:t xml:space="preserve">  Hotspot heatmap · System Administration &amp; Security (user mgmt + audit + RLS + backup).</w:t>
+      </w:r>
+    </w:p>
+    <w:p>
+      <w:pPr>
+        <w:pStyle w:val="ListBullet"/>
+      </w:pPr>
+      <w:r>
+        <w:rPr>
+          <w:b/>
+        </w:rPr>
+        <w:t>Leave out (feature-level → Chapter IV only):</w:t>
+      </w:r>
+      <w:r>
+        <w:t xml:space="preserve"> PNG/ID downloads, drag-resize circle, household</w:t>
+      </w:r>
+    </w:p>
+    <w:p>
+      <w:r>
+        <w:t xml:space="preserve">  overlay, radius slider, status dropdown, pagination, "Others" reason, sitio auto-fill, photo</w:t>
+      </w:r>
+    </w:p>
+    <w:p>
+      <w:r>
+        <w:t xml:space="preserve">  attachments.</w:t>
       </w:r>
     </w:p>
     <w:p>

</xml_diff>

<commit_message>
Docs audit: cross-chapter coverage + Ch II/V + unfinished placeholders
Extends the audit beyond Chapter I: a cross-chapter table propagating the
5 module additions (OSY, Announcements, QR docs, hotspot, admin/security)
to every place the modules are listed (Ch II research gap, Ch IV
Functional/Data Requirements); a Chapter II note; an optional Ch V
recommendation (HMAC QR signing); and a list of unfinished placeholder
sections the author must supply (End-User Rating, Sample Reports, User's
Guide, CV). Regenerated the .docx.
</commit_message>
<xml_diff>
--- a/docx/DOCUMENTATION_FIXES.docx
+++ b/docx/DOCUMENTATION_FIXES.docx
@@ -880,6 +880,663 @@
     <w:p>
       <w:r>
         <w:t xml:space="preserve">  attachments.</w:t>
+      </w:r>
+    </w:p>
+    <w:p>
+      <w:r>
+        <w:rPr>
+          <w:color w:val="CCCCCC"/>
+        </w:rPr>
+        <w:t>__________________________________________________</w:t>
+      </w:r>
+    </w:p>
+    <w:p>
+      <w:pPr>
+        <w:pStyle w:val="Heading2"/>
+      </w:pPr>
+      <w:r>
+        <w:t>CROSS-CHAPTER — propagate the same coverage fixes everywhere the modules are listed</w:t>
+      </w:r>
+    </w:p>
+    <w:p>
+      <w:r>
+        <w:t xml:space="preserve">The paper lists PROTECT's modules in </w:t>
+      </w:r>
+      <w:r>
+        <w:rPr>
+          <w:b/>
+        </w:rPr>
+        <w:t>several places</w:t>
+      </w:r>
+      <w:r>
+        <w:t>. They were all written from the same</w:t>
+      </w:r>
+    </w:p>
+    <w:p>
+      <w:r>
+        <w:t xml:space="preserve">outdated list, so the </w:t>
+      </w:r>
+      <w:r>
+        <w:rPr>
+          <w:b/>
+        </w:rPr>
+        <w:t>same five additions</w:t>
+      </w:r>
+      <w:r>
+        <w:t xml:space="preserve"> (OSY · Announcements · QR document issuance · Crime</w:t>
+      </w:r>
+    </w:p>
+    <w:p>
+      <w:r>
+        <w:t>Hotspot heatmap · System Admin &amp; Security) must be applied to each. Check every one:</w:t>
+      </w:r>
+    </w:p>
+    <w:tbl>
+      <w:tblPr>
+        <w:tblStyle w:val="LightGrid-Accent1"/>
+        <w:tblW w:type="auto" w:w="0"/>
+        <w:tblLook w:firstColumn="1" w:firstRow="1" w:lastColumn="0" w:lastRow="0" w:noHBand="0" w:noVBand="1" w:val="04A0"/>
+      </w:tblPr>
+      <w:tblGrid>
+        <w:gridCol w:w="4320"/>
+        <w:gridCol w:w="4320"/>
+      </w:tblGrid>
+      <w:tr>
+        <w:tc>
+          <w:tcPr>
+            <w:tcW w:type="dxa" w:w="4320"/>
+          </w:tcPr>
+          <w:p>
+            <w:r>
+              <w:rPr>
+                <w:b/>
+              </w:rPr>
+            </w:r>
+            <w:r>
+              <w:rPr>
+                <w:b/>
+              </w:rPr>
+              <w:t>Location</w:t>
+            </w:r>
+          </w:p>
+        </w:tc>
+        <w:tc>
+          <w:tcPr>
+            <w:tcW w:type="dxa" w:w="4320"/>
+          </w:tcPr>
+          <w:p>
+            <w:r>
+              <w:rPr>
+                <w:b/>
+              </w:rPr>
+            </w:r>
+            <w:r>
+              <w:rPr>
+                <w:b/>
+              </w:rPr>
+              <w:t>What to do</w:t>
+            </w:r>
+          </w:p>
+        </w:tc>
+      </w:tr>
+      <w:tr>
+        <w:tc>
+          <w:tcPr>
+            <w:tcW w:type="dxa" w:w="4320"/>
+          </w:tcPr>
+          <w:p>
+            <w:r/>
+            <w:r>
+              <w:t>Ch I — Scope bullets</w:t>
+            </w:r>
+          </w:p>
+        </w:tc>
+        <w:tc>
+          <w:tcPr>
+            <w:tcW w:type="dxa" w:w="4320"/>
+          </w:tcPr>
+          <w:p>
+            <w:r/>
+            <w:r>
+              <w:t>Items ⓐ–ⓔ above</w:t>
+            </w:r>
+          </w:p>
+        </w:tc>
+      </w:tr>
+      <w:tr>
+        <w:tc>
+          <w:tcPr>
+            <w:tcW w:type="dxa" w:w="4320"/>
+          </w:tcPr>
+          <w:p>
+            <w:r/>
+            <w:r>
+              <w:t>Ch I — Conceptual Framework (p.8)</w:t>
+            </w:r>
+          </w:p>
+        </w:tc>
+        <w:tc>
+          <w:tcPr>
+            <w:tcW w:type="dxa" w:w="4320"/>
+          </w:tcPr>
+          <w:p>
+            <w:r/>
+            <w:r>
+              <w:t>Item ⓕ above (count + Process box)</w:t>
+            </w:r>
+          </w:p>
+        </w:tc>
+      </w:tr>
+      <w:tr>
+        <w:tc>
+          <w:tcPr>
+            <w:tcW w:type="dxa" w:w="4320"/>
+          </w:tcPr>
+          <w:p>
+            <w:r/>
+            <w:r>
+              <w:rPr>
+                <w:b/>
+              </w:rPr>
+              <w:t>Ch II — "Synthesis and Research Gap" (p.17)</w:t>
+            </w:r>
+          </w:p>
+        </w:tc>
+        <w:tc>
+          <w:tcPr>
+            <w:tcW w:type="dxa" w:w="4320"/>
+          </w:tcPr>
+          <w:p>
+            <w:r/>
+            <w:r>
+              <w:t xml:space="preserve">The sentence beginning </w:t>
+            </w:r>
+            <w:r>
+              <w:rPr>
+                <w:i/>
+              </w:rPr>
+              <w:t>"PROTECT aims to address this gap by providing…"</w:t>
+            </w:r>
+            <w:r>
+              <w:t xml:space="preserve"> lists the modules — add </w:t>
+            </w:r>
+            <w:r>
+              <w:rPr>
+                <w:b/>
+              </w:rPr>
+              <w:t>out-of-school-youth categorization, community announcements, a crime hotspot heatmap, and an audit trail / role-based database security</w:t>
+            </w:r>
+            <w:r>
+              <w:t xml:space="preserve"> to that sentence.</w:t>
+            </w:r>
+          </w:p>
+        </w:tc>
+      </w:tr>
+      <w:tr>
+        <w:tc>
+          <w:tcPr>
+            <w:tcW w:type="dxa" w:w="4320"/>
+          </w:tcPr>
+          <w:p>
+            <w:r/>
+            <w:r>
+              <w:rPr>
+                <w:b/>
+              </w:rPr>
+              <w:t>Ch IV — B. Functional Requirements (p.33)</w:t>
+            </w:r>
+          </w:p>
+        </w:tc>
+        <w:tc>
+          <w:tcPr>
+            <w:tcW w:type="dxa" w:w="4320"/>
+          </w:tcPr>
+          <w:p>
+            <w:r/>
+            <w:r>
+              <w:t xml:space="preserve">ADD four missing items: </w:t>
+            </w:r>
+            <w:r>
+              <w:rPr>
+                <w:b/>
+              </w:rPr>
+              <w:t>Crime Hotspot Mapping</w:t>
+            </w:r>
+            <w:r>
+              <w:t xml:space="preserve">, </w:t>
+            </w:r>
+            <w:r>
+              <w:rPr>
+                <w:b/>
+              </w:rPr>
+              <w:t>Community Announcements</w:t>
+            </w:r>
+            <w:r>
+              <w:t xml:space="preserve">, </w:t>
+            </w:r>
+            <w:r>
+              <w:rPr>
+                <w:b/>
+              </w:rPr>
+              <w:t>User Management</w:t>
+            </w:r>
+            <w:r>
+              <w:t xml:space="preserve">, </w:t>
+            </w:r>
+            <w:r>
+              <w:rPr>
+                <w:b/>
+              </w:rPr>
+              <w:t>System &amp; Audit (Activity Log + Database Backup)</w:t>
+            </w:r>
+            <w:r>
+              <w:t xml:space="preserve">; and rename "Senior Citizen, Solo Parent, and PWD Statistics" → </w:t>
+            </w:r>
+            <w:r>
+              <w:rPr>
+                <w:b/>
+              </w:rPr>
+              <w:t>"…and Out-of-School Youth Statistics."</w:t>
+            </w:r>
+          </w:p>
+        </w:tc>
+      </w:tr>
+      <w:tr>
+        <w:tc>
+          <w:tcPr>
+            <w:tcW w:type="dxa" w:w="4320"/>
+          </w:tcPr>
+          <w:p>
+            <w:r/>
+            <w:r>
+              <w:rPr>
+                <w:b/>
+              </w:rPr>
+              <w:t>Ch IV — F. Data Requirements (p.35)</w:t>
+            </w:r>
+          </w:p>
+        </w:tc>
+        <w:tc>
+          <w:tcPr>
+            <w:tcW w:type="dxa" w:w="4320"/>
+          </w:tcPr>
+          <w:p>
+            <w:r/>
+            <w:r>
+              <w:t xml:space="preserve">ADD </w:t>
+            </w:r>
+            <w:r>
+              <w:rPr>
+                <w:b/>
+              </w:rPr>
+              <w:t>Announcement content</w:t>
+            </w:r>
+            <w:r>
+              <w:t xml:space="preserve">, </w:t>
+            </w:r>
+            <w:r>
+              <w:rPr>
+                <w:b/>
+              </w:rPr>
+              <w:t>QR identifiers / verification logs</w:t>
+            </w:r>
+            <w:r>
+              <w:t xml:space="preserve">, and </w:t>
+            </w:r>
+            <w:r>
+              <w:rPr>
+                <w:b/>
+              </w:rPr>
+              <w:t>Audit logs</w:t>
+            </w:r>
+            <w:r>
+              <w:t xml:space="preserve"> to the data list.</w:t>
+            </w:r>
+          </w:p>
+        </w:tc>
+      </w:tr>
+      <w:tr>
+        <w:tc>
+          <w:tcPr>
+            <w:tcW w:type="dxa" w:w="4320"/>
+          </w:tcPr>
+          <w:p>
+            <w:r/>
+            <w:r>
+              <w:t>Ch IV — C. User Requirements (p.33)</w:t>
+            </w:r>
+          </w:p>
+        </w:tc>
+        <w:tc>
+          <w:tcPr>
+            <w:tcW w:type="dxa" w:w="4320"/>
+          </w:tcPr>
+          <w:p>
+            <w:r/>
+            <w:r>
+              <w:t xml:space="preserve">(Optional) add </w:t>
+            </w:r>
+            <w:r>
+              <w:rPr>
+                <w:b/>
+              </w:rPr>
+              <w:t>User &amp; Role Management</w:t>
+            </w:r>
+            <w:r>
+              <w:t xml:space="preserve"> and </w:t>
+            </w:r>
+            <w:r>
+              <w:rPr>
+                <w:b/>
+              </w:rPr>
+              <w:t>Audit Log Review</w:t>
+            </w:r>
+            <w:r>
+              <w:t>.</w:t>
+            </w:r>
+          </w:p>
+        </w:tc>
+      </w:tr>
+      <w:tr>
+        <w:tc>
+          <w:tcPr>
+            <w:tcW w:type="dxa" w:w="4320"/>
+          </w:tcPr>
+          <w:p>
+            <w:r/>
+            <w:r>
+              <w:t>Ch IV — D. Non-Functional Requirements (p.34)</w:t>
+            </w:r>
+          </w:p>
+        </w:tc>
+        <w:tc>
+          <w:tcPr>
+            <w:tcW w:type="dxa" w:w="4320"/>
+          </w:tcPr>
+          <w:p>
+            <w:r/>
+            <w:r>
+              <w:t xml:space="preserve">(Optional) add </w:t>
+            </w:r>
+            <w:r>
+              <w:rPr>
+                <w:b/>
+              </w:rPr>
+              <w:t>Accountability / Auditability</w:t>
+            </w:r>
+            <w:r>
+              <w:t xml:space="preserve"> and </w:t>
+            </w:r>
+            <w:r>
+              <w:rPr>
+                <w:b/>
+              </w:rPr>
+              <w:t>Data Privacy (RA 10173 compliance)</w:t>
+            </w:r>
+            <w:r>
+              <w:t>.</w:t>
+            </w:r>
+          </w:p>
+        </w:tc>
+      </w:tr>
+      <w:tr>
+        <w:tc>
+          <w:tcPr>
+            <w:tcW w:type="dxa" w:w="4320"/>
+          </w:tcPr>
+          <w:p>
+            <w:r/>
+            <w:r>
+              <w:t>Ch IV — Design walkthrough (Figs 11–27)</w:t>
+            </w:r>
+          </w:p>
+        </w:tc>
+        <w:tc>
+          <w:tcPr>
+            <w:tcW w:type="dxa" w:w="4320"/>
+          </w:tcPr>
+          <w:p>
+            <w:r/>
+            <w:r>
+              <w:t>Add the 4 missing module figures (see the "NEW module sections" list below).</w:t>
+            </w:r>
+          </w:p>
+        </w:tc>
+      </w:tr>
+    </w:tbl>
+    <w:p/>
+    <w:p>
+      <w:r>
+        <w:rPr>
+          <w:color w:val="CCCCCC"/>
+        </w:rPr>
+        <w:t>__________________________________________________</w:t>
+      </w:r>
+    </w:p>
+    <w:p>
+      <w:pPr>
+        <w:pStyle w:val="Heading2"/>
+      </w:pPr>
+      <w:r>
+        <w:t>CHAPTER II — Review of Related Literature/Systems</w:t>
+      </w:r>
+    </w:p>
+    <w:p>
+      <w:r>
+        <w:t xml:space="preserve">🟢 The literature/citations are your research — leave them. The </w:t>
+      </w:r>
+      <w:r>
+        <w:rPr>
+          <w:b/>
+        </w:rPr>
+        <w:t>only</w:t>
+      </w:r>
+      <w:r>
+        <w:t xml:space="preserve"> system-fact in this chapter</w:t>
+      </w:r>
+    </w:p>
+    <w:p>
+      <w:r>
+        <w:t xml:space="preserve">is the </w:t>
+      </w:r>
+      <w:r>
+        <w:rPr>
+          <w:b/>
+        </w:rPr>
+        <w:t>"Synthesis and Research Gap"</w:t>
+      </w:r>
+      <w:r>
+        <w:t xml:space="preserve"> paragraph (p.17), which restates PROTECT's module list with</w:t>
+      </w:r>
+    </w:p>
+    <w:p>
+      <w:r>
+        <w:t>the same gaps. Update that one sentence per the table above (add OSY, announcements, crime hotspot,</w:t>
+      </w:r>
+    </w:p>
+    <w:p>
+      <w:r>
+        <w:t>audit/RLS). Nothing else in Chapter II needs changing.</w:t>
+      </w:r>
+    </w:p>
+    <w:p>
+      <w:r>
+        <w:rPr>
+          <w:color w:val="CCCCCC"/>
+        </w:rPr>
+        <w:t>__________________________________________________</w:t>
+      </w:r>
+    </w:p>
+    <w:p>
+      <w:pPr>
+        <w:pStyle w:val="Heading2"/>
+      </w:pPr>
+      <w:r>
+        <w:t>UNFINISHED SECTIONS — content only you can supply (placeholders in the paper)</w:t>
+      </w:r>
+    </w:p>
+    <w:p>
+      <w:r>
+        <w:t>These are blank ("…") in the current draft — not errors, but they must be filled before submission:</w:t>
+      </w:r>
+    </w:p>
+    <w:p>
+      <w:pPr>
+        <w:pStyle w:val="ListBullet"/>
+      </w:pPr>
+      <w:r>
+        <w:t xml:space="preserve">🔴 </w:t>
+      </w:r>
+      <w:r>
+        <w:rPr>
+          <w:b/>
+        </w:rPr>
+        <w:t>End-User Experience Rating</w:t>
+      </w:r>
+      <w:r>
+        <w:t xml:space="preserve"> (Ch IV, p.61) — you still need to </w:t>
+      </w:r>
+      <w:r>
+        <w:rPr>
+          <w:b/>
+        </w:rPr>
+        <w:t>conduct the evaluation</w:t>
+      </w:r>
+    </w:p>
+    <w:p>
+      <w:r>
+        <w:t xml:space="preserve">  (e.g. a Likert/ISO 25010 or PSSUQ survey with the barangay end-users) and tabulate the results.</w:t>
+      </w:r>
+    </w:p>
+    <w:p>
+      <w:r>
+        <w:t xml:space="preserve">  This is usually a graded requirement; don't leave it empty.</w:t>
+      </w:r>
+    </w:p>
+    <w:p>
+      <w:pPr>
+        <w:pStyle w:val="ListBullet"/>
+      </w:pPr>
+      <w:r>
+        <w:t xml:space="preserve">🟠 </w:t>
+      </w:r>
+      <w:r>
+        <w:rPr>
+          <w:b/>
+        </w:rPr>
+        <w:t>Sample Reports Generated by the System</w:t>
+      </w:r>
+      <w:r>
+        <w:t xml:space="preserve"> (Appendix, p.66) — paste 1–2 exported DILG report</w:t>
+      </w:r>
+    </w:p>
+    <w:p>
+      <w:r>
+        <w:t xml:space="preserve">  PDFs (e.g. Barangay Profile, Peace &amp; Order).</w:t>
+      </w:r>
+    </w:p>
+    <w:p>
+      <w:pPr>
+        <w:pStyle w:val="ListBullet"/>
+      </w:pPr>
+      <w:r>
+        <w:t xml:space="preserve">🟠 </w:t>
+      </w:r>
+      <w:r>
+        <w:rPr>
+          <w:b/>
+        </w:rPr>
+        <w:t>User's Guide</w:t>
+      </w:r>
+      <w:r>
+        <w:t xml:space="preserve"> (Appendix, p.67) — a short how-to (login, add resident, generate QR, log</w:t>
+      </w:r>
+    </w:p>
+    <w:p>
+      <w:r>
+        <w:t xml:space="preserve">  incident, run a report). The </w:t>
+      </w:r>
+      <w:r>
+        <w:rPr>
+          <w:rFonts w:ascii="Consolas" w:hAnsi="Consolas"/>
+          <w:color w:val="B03060"/>
+          <w:sz w:val="20"/>
+        </w:rPr>
+        <w:t>TESTING_GUIDE</w:t>
+      </w:r>
+      <w:r>
+        <w:t xml:space="preserve"> and per-module Chapter IV descriptions can seed this.</w:t>
+      </w:r>
+    </w:p>
+    <w:p>
+      <w:pPr>
+        <w:pStyle w:val="ListBullet"/>
+      </w:pPr>
+      <w:r>
+        <w:t xml:space="preserve">🟠 </w:t>
+      </w:r>
+      <w:r>
+        <w:rPr>
+          <w:b/>
+        </w:rPr>
+        <w:t>One-page Curriculum Vitae</w:t>
+      </w:r>
+      <w:r>
+        <w:t xml:space="preserve"> (Appendix, p.68) — team member CV(s).</w:t>
+      </w:r>
+    </w:p>
+    <w:p>
+      <w:r>
+        <w:rPr>
+          <w:color w:val="CCCCCC"/>
+        </w:rPr>
+        <w:t>__________________________________________________</w:t>
+      </w:r>
+    </w:p>
+    <w:p>
+      <w:pPr>
+        <w:pStyle w:val="Heading2"/>
+      </w:pPr>
+      <w:r>
+        <w:t>CHAPTER V / RECOMMENDATIONS — optional addition</w:t>
+      </w:r>
+    </w:p>
+    <w:p>
+      <w:r>
+        <w:t>🟢 The recommendations are solid and match the limitations. One optional add that ties to the</w:t>
+      </w:r>
+    </w:p>
+    <w:p>
+      <w:r>
+        <w:t xml:space="preserve">security discussion: </w:t>
+      </w:r>
+      <w:r>
+        <w:rPr>
+          <w:b/>
+        </w:rPr>
+        <w:t>"Strengthen QR security with server-side cryptographic signing (HMAC)"</w:t>
+      </w:r>
+      <w:r>
+        <w:t xml:space="preserve"> —</w:t>
+      </w:r>
+    </w:p>
+    <w:p>
+      <w:r>
+        <w:t>the current QR uses a SHA-256 hash that hides PII but is not forgery-proof; signing would prevent</w:t>
+      </w:r>
+    </w:p>
+    <w:p>
+      <w:r>
+        <w:t xml:space="preserve">forged codes. (Do </w:t>
+      </w:r>
+      <w:r>
+        <w:rPr>
+          <w:b/>
+        </w:rPr>
+        <w:t>not</w:t>
+      </w:r>
+      <w:r>
+        <w:t xml:space="preserve"> recommend an audit trail or RLS — those already exist.)</w:t>
       </w:r>
     </w:p>
     <w:p>

</xml_diff>